<commit_message>
Corrige pedido especial nos gabaritos do Conteúdo 1 (comissão sobre o preço do lote) e redação da letra c da Panificadora
Co-Authored-By: Claude Opus 5.5 <noreply@anthropic.com>
Claude-Session: https://claude.ai/code/session_011MUGNEMWRsLJUKMUMKSx3L
</commit_message>
<xml_diff>
--- a/arquivos/Agroindustria_Grao_Dourado_Custos_MC_Gabarito.docx
+++ b/arquivos/Agroindustria_Grao_Dourado_Custos_MC_Gabarito.docx
@@ -7172,7 +7172,7 @@
         <w:t xml:space="preserve">mais</w:t>
       </w:r>
       <w:r>
-        <w:t xml:space="preserve"> a despesa variável unitária de venda ($ 0,718/kg — comissão, frete e embalagem, que incidem sobre qualquer unidade vendida, inclusive esse lote especial), pois os custos e despesas fixas já estão cobertos pela operação atual e não aumentam com esse lote adicional.</w:t>
+        <w:t xml:space="preserve"> a despesa variável unitária de venda ($ 0,655/kg: comissão de 3% calculada sobre o preço do lote (3% × 3,50 = $ 0,105) mais frete e embalagem ($ 0,55), que incidem sobre qualquer unidade vendida, inclusive esse lote especial), pois os custos e despesas fixas já estão cobertos pela operação atual e não aumentam com esse lote adicional.</w:t>
       </w:r>
     </w:p>
     <w:p>
@@ -7184,7 +7184,7 @@
           <w:b/>
           <w:bCs/>
         </w:rPr>
-        <w:t xml:space="preserve">Margem de contribuição do lote adicional: 3,50 − 1,70 − 0,718 ≈ $ 1,08 por quilo (positiva).</w:t>
+        <w:t>Margem de contribuição do lote adicional: 3,50 − 1,70 − 0,655 = $ 1,145 por quilo (positiva).</w:t>
       </w:r>
     </w:p>
     <w:p>
@@ -7192,14 +7192,14 @@
         <w:spacing w:after="120"/>
       </w:pPr>
       <w:r>
-        <w:t xml:space="preserve">Ganho estimado: 30.000 × 1,08 ≈ </w:t>
+        <w:t xml:space="preserve">Ganho estimado: 30.000 × 1,145 = </w:t>
       </w:r>
       <w:r>
         <w:rPr>
           <w:b/>
           <w:bCs/>
         </w:rPr>
-        <w:t xml:space="preserve">$ 32.460,00</w:t>
+        <w:t>$ 34.350,00</w:t>
       </w:r>
       <w:r>
         <w:t xml:space="preserve">.</w:t>

</xml_diff>